<commit_message>
Sync root fulltime resume PDF/DOCX with public copies
Made-with: Cursor
</commit_message>
<xml_diff>
--- a/Java_FullStack_FullTime_Resume.docx
+++ b/Java_FullStack_FullTime_Resume.docx
@@ -13,7 +13,7 @@
           <w:sz w:val="22"/>
           <w:szCs w:val="22"/>
         </w:rPr>
-        <w:t xml:space="preserve">456-961-7695</w:t>
+        <w:t xml:space="preserve"/>
       </w:r>
     </w:p>
     <w:p>
@@ -152,7 +152,7 @@
           <w:sz w:val="22"/>
           <w:szCs w:val="22"/>
         </w:rPr>
-        <w:t xml:space="preserve">Java Full Stack Engineer – Mad Mobile</w:t>
+        <w:t xml:space="preserve">Full Stack Engineer – Retail Technology Company</w:t>
       </w:r>
     </w:p>
     <w:p>
@@ -232,7 +232,7 @@
           <w:sz w:val="22"/>
           <w:szCs w:val="22"/>
         </w:rPr>
-        <w:t xml:space="preserve">Java Full Stack Engineer – Corebridge Financial</w:t>
+        <w:t xml:space="preserve">Java Full Stack Engineer – Financial Services Company</w:t>
       </w:r>
     </w:p>
     <w:p>
@@ -312,7 +312,7 @@
           <w:sz w:val="22"/>
           <w:szCs w:val="22"/>
         </w:rPr>
-        <w:t xml:space="preserve">Java Full Stack Engineer – ConocoPhillips</w:t>
+        <w:t xml:space="preserve">Java Full Stack Engineer – Energy Company</w:t>
       </w:r>
     </w:p>
     <w:p>
@@ -379,7 +379,7 @@
           <w:sz w:val="22"/>
           <w:szCs w:val="22"/>
         </w:rPr>
-        <w:t xml:space="preserve">Java Full Stack Engineer – Infosys</w:t>
+        <w:t xml:space="preserve">Java Full Stack Engineer – Global IT Services Company</w:t>
       </w:r>
     </w:p>
     <w:p>
@@ -446,7 +446,7 @@
           <w:sz w:val="22"/>
           <w:szCs w:val="22"/>
         </w:rPr>
-        <w:t xml:space="preserve">Java Full Stack Engineer – Elder Pharmaceuticals</w:t>
+        <w:t xml:space="preserve">Java Full Stack Engineer – Pharmaceutical Manufacturing Company</w:t>
       </w:r>
     </w:p>
     <w:p>

</xml_diff>

<commit_message>
Restore employer names on resume data, README, C2C text, and regenerated PDFs
Made-with: Cursor
</commit_message>
<xml_diff>
--- a/Java_FullStack_FullTime_Resume.docx
+++ b/Java_FullStack_FullTime_Resume.docx
@@ -152,7 +152,7 @@
           <w:sz w:val="22"/>
           <w:szCs w:val="22"/>
         </w:rPr>
-        <w:t xml:space="preserve">Full Stack Engineer – Retail Technology Company</w:t>
+        <w:t xml:space="preserve">Full Stack Engineer – Mad Mobile</w:t>
       </w:r>
     </w:p>
     <w:p>
@@ -232,7 +232,7 @@
           <w:sz w:val="22"/>
           <w:szCs w:val="22"/>
         </w:rPr>
-        <w:t xml:space="preserve">Java Full Stack Engineer – Financial Services Company</w:t>
+        <w:t xml:space="preserve">Java Full Stack Engineer – Corebridge Financial</w:t>
       </w:r>
     </w:p>
     <w:p>
@@ -312,7 +312,7 @@
           <w:sz w:val="22"/>
           <w:szCs w:val="22"/>
         </w:rPr>
-        <w:t xml:space="preserve">Java Full Stack Engineer – Energy Company</w:t>
+        <w:t xml:space="preserve">Java Full Stack Engineer – ConocoPhillips</w:t>
       </w:r>
     </w:p>
     <w:p>
@@ -379,7 +379,7 @@
           <w:sz w:val="22"/>
           <w:szCs w:val="22"/>
         </w:rPr>
-        <w:t xml:space="preserve">Java Full Stack Engineer – Global IT Services Company</w:t>
+        <w:t xml:space="preserve">Java Full Stack Engineer – Infosys</w:t>
       </w:r>
     </w:p>
     <w:p>
@@ -446,7 +446,7 @@
           <w:sz w:val="22"/>
           <w:szCs w:val="22"/>
         </w:rPr>
-        <w:t xml:space="preserve">Java Full Stack Engineer – Pharmaceutical Manufacturing Company</w:t>
+        <w:t xml:space="preserve">Java Full Stack Engineer – Elder Pharmaceuticals</w:t>
       </w:r>
     </w:p>
     <w:p>

</xml_diff>